<commit_message>
Refactor paper content and structure: Updated title and abstract for clarity, removed temporary files, and added new version of the document.
</commit_message>
<xml_diff>
--- a/paper/paper_v1.docx
+++ b/paper/paper_v1.docx
@@ -3,13 +3,27 @@
 <w:document xmlns:wpc="http://schemas.microsoft.com/office/word/2010/wordprocessingCanvas" xmlns:cx="http://schemas.microsoft.com/office/drawing/2014/chartex" xmlns:cx1="http://schemas.microsoft.com/office/drawing/2015/9/8/chartex" xmlns:cx2="http://schemas.microsoft.com/office/drawing/2015/10/21/chartex" xmlns:cx3="http://schemas.microsoft.com/office/drawing/2016/5/9/chartex" xmlns:cx4="http://schemas.microsoft.com/office/drawing/2016/5/10/chartex" xmlns:cx5="http://schemas.microsoft.com/office/drawing/2016/5/11/chartex" xmlns:cx6="http://schemas.microsoft.com/office/drawing/2016/5/12/chartex" xmlns:cx7="http://schemas.microsoft.com/office/drawing/2016/5/13/chartex" xmlns:cx8="http://schemas.microsoft.com/office/drawing/2016/5/14/chartex" xmlns:mc="http://schemas.openxmlformats.org/markup-compatibility/2006" xmlns:aink="http://schemas.microsoft.com/office/drawing/2016/ink" xmlns:am3d="http://schemas.microsoft.com/office/drawing/2017/model3d" xmlns:o="urn:schemas-microsoft-com:office:office" xmlns:oel="http://schemas.microsoft.com/office/2019/extlst" xmlns:r="http://schemas.openxmlformats.org/officeDocument/2006/relationships" xmlns:m="http://schemas.openxmlformats.org/officeDocument/2006/math" xmlns:v="urn:schemas-microsoft-com:vml" xmlns:wp14="http://schemas.microsoft.com/office/word/2010/wordprocessingDrawing" xmlns:wp="http://schemas.openxmlformats.org/drawingml/2006/wordprocessingDrawing" xmlns:w10="urn:schemas-microsoft-com:office:word" xmlns:w="http://schemas.openxmlformats.org/wordprocessingml/2006/main" xmlns:w14="http://schemas.microsoft.com/office/word/2010/wordml" xmlns:w15="http://schemas.microsoft.com/office/word/2012/wordml" xmlns:w16cex="http://schemas.microsoft.com/office/word/2018/wordml/cex" xmlns:w16cid="http://schemas.microsoft.com/office/word/2016/wordml/cid" xmlns:w16="http://schemas.microsoft.com/office/word/2018/wordml" xmlns:w16du="http://schemas.microsoft.com/office/word/2023/wordml/word16du" xmlns:w16sdtdh="http://schemas.microsoft.com/office/word/2020/wordml/sdtdatahash" xmlns:w16sdtfl="http://schemas.microsoft.com/office/word/2024/wordml/sdtformatlock" xmlns:w16se="http://schemas.microsoft.com/office/word/2015/wordml/symex" xmlns:wpg="http://schemas.microsoft.com/office/word/2010/wordprocessingGroup" xmlns:wpi="http://schemas.microsoft.com/office/word/2010/wordprocessingInk" xmlns:wne="http://schemas.microsoft.com/office/word/2006/wordml" xmlns:wps="http://schemas.microsoft.com/office/word/2010/wordprocessingShape" mc:Ignorable="w14 w15 w16se w16cid w16 w16cex w16sdtdh w16sdtfl w16du wp14">
   <w:body>
     <w:p>
+      <w:r>
+        <w:t>When Coding Agents Repeat: Persistence, Reinforcement, and the Limits of Loop Breaking</w:t>
+      </w:r>
+      <w:r>
+        <w:rPr>
+          <w:rFonts w:hint="eastAsia"/>
+        </w:rPr>
+        <w:t xml:space="preserve"> </w:t>
+      </w:r>
+    </w:p>
+    <w:p>
       <w:pPr>
         <w:rPr>
           <w:rFonts w:hint="eastAsia"/>
         </w:rPr>
       </w:pPr>
       <w:r>
-        <w:t>When Coding Agents Repeat: Persistence, Reinforcement, and the Limits of Loop Breaking</w:t>
+        <w:rPr>
+          <w:rFonts w:hint="eastAsia"/>
+        </w:rPr>
+        <w:t>Subtitle is undecided yet</w:t>
       </w:r>
     </w:p>
     <w:p>
@@ -33,12 +47,6 @@
           <w:t>zha.j@northeastern.edu</w:t>
         </w:r>
       </w:hyperlink>
-      <w:r>
-        <w:rPr>
-          <w:rFonts w:hint="eastAsia"/>
-        </w:rPr>
-        <w:t>, AI Assistants (Claude, ChatGPT)</w:t>
-      </w:r>
     </w:p>
     <w:p>
       <w:pPr>
@@ -55,290 +63,566 @@
       </w:r>
     </w:p>
     <w:p>
+      <w:r>
+        <w:rPr>
+          <w:rFonts w:hint="eastAsia"/>
+        </w:rPr>
+        <w:t xml:space="preserve">During the </w:t>
+      </w:r>
+      <w:r>
+        <w:rPr>
+          <w:rFonts w:hint="eastAsia"/>
+        </w:rPr>
+        <w:t xml:space="preserve">agentic workflow improvement and post training of Gemma 4 31B, we </w:t>
+      </w:r>
+      <w:r>
+        <w:rPr>
+          <w:rFonts w:hint="eastAsia"/>
+        </w:rPr>
+        <w:t>found</w:t>
+      </w:r>
+      <w:r>
+        <w:rPr>
+          <w:rFonts w:hint="eastAsia"/>
+        </w:rPr>
+        <w:t xml:space="preserve"> that there </w:t>
+      </w:r>
+      <w:r>
+        <w:rPr>
+          <w:rFonts w:hint="eastAsia"/>
+        </w:rPr>
+        <w:t>a reproducible class</w:t>
+      </w:r>
+      <w:r>
+        <w:rPr>
+          <w:rFonts w:hint="eastAsia"/>
+        </w:rPr>
+        <w:t xml:space="preserve"> of failure</w:t>
+      </w:r>
+      <w:r>
+        <w:rPr>
+          <w:rFonts w:hint="eastAsia"/>
+        </w:rPr>
+        <w:t>s</w:t>
+      </w:r>
+      <w:r>
+        <w:rPr>
+          <w:rFonts w:hint="eastAsia"/>
+        </w:rPr>
+        <w:t xml:space="preserve"> caused by repeated tool call</w:t>
+      </w:r>
+      <w:r>
+        <w:rPr>
+          <w:rFonts w:hint="eastAsia"/>
+        </w:rPr>
+        <w:t>s</w:t>
+      </w:r>
+      <w:r>
+        <w:rPr>
+          <w:rFonts w:hint="eastAsia"/>
+        </w:rPr>
+        <w:t xml:space="preserve"> until </w:t>
+      </w:r>
+      <w:r>
+        <w:rPr>
+          <w:rFonts w:hint="eastAsia"/>
+        </w:rPr>
+        <w:t>the budget runs out</w:t>
+      </w:r>
+      <w:r>
+        <w:rPr>
+          <w:rFonts w:hint="eastAsia"/>
+        </w:rPr>
+        <w:t xml:space="preserve">. We </w:t>
+      </w:r>
+      <w:r>
+        <w:rPr>
+          <w:rFonts w:hint="eastAsia"/>
+        </w:rPr>
+        <w:t>want to</w:t>
+      </w:r>
+      <w:r>
+        <w:rPr>
+          <w:rFonts w:hint="eastAsia"/>
+        </w:rPr>
+        <w:t xml:space="preserve"> </w:t>
+      </w:r>
+      <w:r>
+        <w:rPr>
+          <w:rFonts w:hint="eastAsia"/>
+        </w:rPr>
+        <w:t>find the cause</w:t>
+      </w:r>
+      <w:r>
+        <w:rPr>
+          <w:rFonts w:hint="eastAsia"/>
+        </w:rPr>
+        <w:t xml:space="preserve"> of this phenomenon</w:t>
+      </w:r>
+      <w:r>
+        <w:rPr>
+          <w:rFonts w:hint="eastAsia"/>
+        </w:rPr>
+        <w:t xml:space="preserve">, </w:t>
+      </w:r>
+      <w:r>
+        <w:rPr>
+          <w:rFonts w:hint="eastAsia"/>
+        </w:rPr>
+        <w:t xml:space="preserve">we call it </w:t>
+      </w:r>
+      <w:r>
+        <w:rPr>
+          <w:rFonts w:hint="eastAsia"/>
+        </w:rPr>
+        <w:t>a</w:t>
+      </w:r>
+      <w:r>
+        <w:rPr>
+          <w:rFonts w:hint="eastAsia"/>
+        </w:rPr>
+        <w:t xml:space="preserve"> loop</w:t>
+      </w:r>
+      <w:r>
+        <w:rPr>
+          <w:rFonts w:hint="eastAsia"/>
+        </w:rPr>
+        <w:t>,</w:t>
+      </w:r>
+      <w:r>
+        <w:rPr>
+          <w:rFonts w:hint="eastAsia"/>
+        </w:rPr>
+        <w:t xml:space="preserve"> and </w:t>
+      </w:r>
+      <w:r>
+        <w:t>interrupt</w:t>
+      </w:r>
+      <w:r>
+        <w:rPr>
+          <w:rFonts w:hint="eastAsia"/>
+        </w:rPr>
+        <w:t xml:space="preserve"> it </w:t>
+      </w:r>
+      <w:r>
+        <w:t>fixed-history replays and whole-task runs</w:t>
+      </w:r>
+      <w:r>
+        <w:rPr>
+          <w:rFonts w:hint="eastAsia"/>
+        </w:rPr>
+        <w:t>.</w:t>
+      </w:r>
+      <w:r>
+        <w:rPr>
+          <w:rFonts w:hint="eastAsia"/>
+        </w:rPr>
+        <w:t xml:space="preserve"> For agent which stops its loop and </w:t>
+      </w:r>
+      <w:r>
+        <w:t>tri</w:t>
+      </w:r>
+      <w:r>
+        <w:rPr>
+          <w:rFonts w:hint="eastAsia"/>
+        </w:rPr>
+        <w:t>es new action, we call it an escape.</w:t>
+      </w:r>
+      <w:r>
+        <w:rPr>
+          <w:rFonts w:hint="eastAsia"/>
+        </w:rPr>
+        <w:t xml:space="preserve"> </w:t>
+      </w:r>
+      <w:r>
+        <w:rPr>
+          <w:rFonts w:hint="eastAsia"/>
+        </w:rPr>
+        <w:t xml:space="preserve">We </w:t>
+      </w:r>
+      <w:r>
+        <w:t>report</w:t>
+      </w:r>
+      <w:r>
+        <w:rPr>
+          <w:rFonts w:hint="eastAsia"/>
+        </w:rPr>
+        <w:t xml:space="preserve"> three findings:</w:t>
+      </w:r>
+      <w:r>
+        <w:rPr>
+          <w:rFonts w:hint="eastAsia"/>
+        </w:rPr>
+        <w:t xml:space="preserve"> </w:t>
+      </w:r>
+      <w:r>
+        <w:rPr>
+          <w:rFonts w:hint="eastAsia"/>
+        </w:rPr>
+        <w:t>(</w:t>
+      </w:r>
+      <w:r>
+        <w:rPr>
+          <w:rFonts w:hint="eastAsia"/>
+        </w:rPr>
+        <w:t>1</w:t>
+      </w:r>
+      <w:r>
+        <w:rPr>
+          <w:rFonts w:hint="eastAsia"/>
+        </w:rPr>
+        <w:t xml:space="preserve">) </w:t>
+      </w:r>
+      <w:r>
+        <w:rPr>
+          <w:rFonts w:hint="eastAsia"/>
+        </w:rPr>
+        <w:t>t</w:t>
+      </w:r>
+      <w:r>
+        <w:rPr>
+          <w:rFonts w:hint="eastAsia"/>
+        </w:rPr>
+        <w:t xml:space="preserve">he </w:t>
+      </w:r>
+      <w:r>
+        <w:rPr>
+          <w:rFonts w:hint="eastAsia"/>
+        </w:rPr>
+        <w:t>possible cause of loop</w:t>
+      </w:r>
+      <w:r>
+        <w:rPr>
+          <w:rFonts w:hint="eastAsia"/>
+        </w:rPr>
+        <w:t>s</w:t>
+      </w:r>
+      <w:r>
+        <w:rPr>
+          <w:rFonts w:hint="eastAsia"/>
+        </w:rPr>
+        <w:t xml:space="preserve"> is that </w:t>
+      </w:r>
+      <w:r>
+        <w:rPr>
+          <w:rFonts w:hint="eastAsia"/>
+        </w:rPr>
+        <w:t>the a</w:t>
+      </w:r>
+      <w:r>
+        <w:rPr>
+          <w:rFonts w:hint="eastAsia"/>
+        </w:rPr>
+        <w:t xml:space="preserve">gent </w:t>
+      </w:r>
+      <w:r>
+        <w:rPr>
+          <w:rFonts w:hint="eastAsia"/>
+        </w:rPr>
+        <w:t>reinforces</w:t>
+      </w:r>
+      <w:r>
+        <w:rPr>
+          <w:rFonts w:hint="eastAsia"/>
+        </w:rPr>
+        <w:t xml:space="preserve"> its </w:t>
+      </w:r>
+      <w:r>
+        <w:rPr>
+          <w:rFonts w:hint="eastAsia"/>
+        </w:rPr>
+        <w:t>latest</w:t>
+      </w:r>
+      <w:r>
+        <w:rPr>
+          <w:rFonts w:hint="eastAsia"/>
+        </w:rPr>
+        <w:t xml:space="preserve"> </w:t>
+      </w:r>
+      <w:r>
+        <w:rPr>
+          <w:rFonts w:hint="eastAsia"/>
+        </w:rPr>
+        <w:t>action</w:t>
+      </w:r>
+      <w:r>
+        <w:rPr>
+          <w:rFonts w:hint="eastAsia"/>
+        </w:rPr>
+        <w:t>s</w:t>
+      </w:r>
+      <w:r>
+        <w:rPr>
+          <w:rFonts w:hint="eastAsia"/>
+        </w:rPr>
+        <w:t xml:space="preserve"> </w:t>
+      </w:r>
+      <w:r>
+        <w:rPr>
+          <w:rFonts w:hint="eastAsia"/>
+        </w:rPr>
+        <w:t xml:space="preserve">in the </w:t>
+      </w:r>
+      <w:r>
+        <w:t>absence</w:t>
+      </w:r>
+      <w:r>
+        <w:rPr>
+          <w:rFonts w:hint="eastAsia"/>
+        </w:rPr>
+        <w:t xml:space="preserve"> of clear positive or negative feedback</w:t>
+      </w:r>
+      <w:r>
+        <w:rPr>
+          <w:rFonts w:hint="eastAsia"/>
+        </w:rPr>
+        <w:t>.</w:t>
+      </w:r>
+      <w:r>
+        <w:rPr>
+          <w:rFonts w:hint="eastAsia"/>
+        </w:rPr>
+        <w:t xml:space="preserve"> </w:t>
+      </w:r>
+      <w:r>
+        <w:rPr>
+          <w:rFonts w:hint="eastAsia"/>
+        </w:rPr>
+        <w:t>Furthermore, t</w:t>
+      </w:r>
+      <w:r>
+        <w:rPr>
+          <w:rFonts w:hint="eastAsia"/>
+        </w:rPr>
+        <w:t>he longer the run, the more likely loop</w:t>
+      </w:r>
+      <w:r>
+        <w:rPr>
+          <w:rFonts w:hint="eastAsia"/>
+        </w:rPr>
+        <w:t>s occur</w:t>
+      </w:r>
+      <w:r>
+        <w:rPr>
+          <w:rFonts w:hint="eastAsia"/>
+        </w:rPr>
+        <w:t xml:space="preserve">; </w:t>
+      </w:r>
+      <w:r>
+        <w:rPr>
+          <w:rFonts w:hint="eastAsia"/>
+        </w:rPr>
+        <w:t>(</w:t>
+      </w:r>
+      <w:r>
+        <w:rPr>
+          <w:rFonts w:hint="eastAsia"/>
+        </w:rPr>
+        <w:t>2</w:t>
+      </w:r>
+      <w:r>
+        <w:rPr>
+          <w:rFonts w:hint="eastAsia"/>
+        </w:rPr>
+        <w:t>)</w:t>
+      </w:r>
+      <w:r>
+        <w:rPr>
+          <w:rFonts w:hint="eastAsia"/>
+        </w:rPr>
+        <w:t xml:space="preserve"> It</w:t>
+      </w:r>
+      <w:r>
+        <w:rPr>
+          <w:rFonts w:hint="eastAsia"/>
+        </w:rPr>
+        <w:t xml:space="preserve"> is</w:t>
+      </w:r>
+      <w:r>
+        <w:rPr>
+          <w:rFonts w:hint="eastAsia"/>
+        </w:rPr>
+        <w:t xml:space="preserve"> possible to </w:t>
+      </w:r>
+      <w:r>
+        <w:rPr>
+          <w:rFonts w:hint="eastAsia"/>
+        </w:rPr>
+        <w:t>induce</w:t>
+      </w:r>
+      <w:r>
+        <w:rPr>
+          <w:rFonts w:hint="eastAsia"/>
+        </w:rPr>
+        <w:t xml:space="preserve"> escaping</w:t>
+      </w:r>
+      <w:r>
+        <w:rPr>
+          <w:rFonts w:hint="eastAsia"/>
+        </w:rPr>
+        <w:t xml:space="preserve"> </w:t>
+      </w:r>
+      <w:r>
+        <w:t>such as a forced thought</w:t>
+      </w:r>
+      <w:r>
+        <w:rPr>
+          <w:rFonts w:hint="eastAsia"/>
+        </w:rPr>
+        <w:t xml:space="preserve"> from loop</w:t>
+      </w:r>
+      <w:r>
+        <w:rPr>
+          <w:rFonts w:hint="eastAsia"/>
+        </w:rPr>
+        <w:t xml:space="preserve"> for partial agents</w:t>
+      </w:r>
+      <w:r>
+        <w:rPr>
+          <w:rFonts w:hint="eastAsia"/>
+        </w:rPr>
+        <w:t xml:space="preserve">. However, </w:t>
+      </w:r>
+      <w:r>
+        <w:t>none of the levers eliminates loops</w:t>
+      </w:r>
+      <w:r>
+        <w:rPr>
+          <w:rFonts w:hint="eastAsia"/>
+        </w:rPr>
+        <w:t xml:space="preserve">; </w:t>
+      </w:r>
+      <w:r>
+        <w:rPr>
+          <w:rFonts w:hint="eastAsia"/>
+        </w:rPr>
+        <w:t>(</w:t>
+      </w:r>
+      <w:r>
+        <w:rPr>
+          <w:rFonts w:hint="eastAsia"/>
+        </w:rPr>
+        <w:t>3</w:t>
+      </w:r>
+      <w:r>
+        <w:rPr>
+          <w:rFonts w:hint="eastAsia"/>
+        </w:rPr>
+        <w:t>)</w:t>
+      </w:r>
+      <w:r>
+        <w:rPr>
+          <w:rFonts w:hint="eastAsia"/>
+        </w:rPr>
+        <w:t xml:space="preserve"> Even </w:t>
+      </w:r>
+      <w:r>
+        <w:rPr>
+          <w:rFonts w:hint="eastAsia"/>
+        </w:rPr>
+        <w:t xml:space="preserve">if </w:t>
+      </w:r>
+      <w:r>
+        <w:rPr>
+          <w:rFonts w:hint="eastAsia"/>
+        </w:rPr>
+        <w:t xml:space="preserve">an </w:t>
+      </w:r>
+      <w:r>
+        <w:rPr>
+          <w:rFonts w:hint="eastAsia"/>
+        </w:rPr>
+        <w:t xml:space="preserve">agent </w:t>
+      </w:r>
+      <w:r>
+        <w:t>escape</w:t>
+      </w:r>
+      <w:r>
+        <w:rPr>
+          <w:rFonts w:hint="eastAsia"/>
+        </w:rPr>
+        <w:t>s</w:t>
+      </w:r>
+      <w:r>
+        <w:rPr>
+          <w:rFonts w:hint="eastAsia"/>
+        </w:rPr>
+        <w:t xml:space="preserve"> from a loop</w:t>
+      </w:r>
+      <w:r>
+        <w:rPr>
+          <w:rFonts w:hint="eastAsia"/>
+        </w:rPr>
+        <w:t xml:space="preserve"> </w:t>
+      </w:r>
+      <w:r>
+        <w:t>successfully</w:t>
+      </w:r>
+      <w:r>
+        <w:rPr>
+          <w:rFonts w:hint="eastAsia"/>
+        </w:rPr>
+        <w:t xml:space="preserve">, it </w:t>
+      </w:r>
+      <w:r>
+        <w:t>does</w:t>
+      </w:r>
+      <w:r>
+        <w:rPr>
+          <w:rFonts w:hint="eastAsia"/>
+        </w:rPr>
+        <w:t xml:space="preserve"> not</w:t>
+      </w:r>
+      <w:r>
+        <w:rPr>
+          <w:rFonts w:hint="eastAsia"/>
+        </w:rPr>
+        <w:t xml:space="preserve"> mean agent can </w:t>
+      </w:r>
+      <w:r>
+        <w:rPr>
+          <w:rFonts w:hint="eastAsia"/>
+        </w:rPr>
+        <w:t>resolve the task</w:t>
+      </w:r>
+      <w:r>
+        <w:rPr>
+          <w:rFonts w:hint="eastAsia"/>
+        </w:rPr>
+        <w:t xml:space="preserve"> </w:t>
+      </w:r>
+      <w:r>
+        <w:rPr>
+          <w:rFonts w:hint="eastAsia"/>
+        </w:rPr>
+        <w:t>before it run</w:t>
+      </w:r>
+      <w:r>
+        <w:rPr>
+          <w:rFonts w:hint="eastAsia"/>
+        </w:rPr>
+        <w:t>s</w:t>
+      </w:r>
+      <w:r>
+        <w:rPr>
+          <w:rFonts w:hint="eastAsia"/>
+        </w:rPr>
+        <w:t xml:space="preserve"> out of budget</w:t>
+      </w:r>
+      <w:r>
+        <w:rPr>
+          <w:rFonts w:hint="eastAsia"/>
+        </w:rPr>
+        <w:t>.</w:t>
+      </w:r>
+    </w:p>
+    <w:p/>
+    <w:p>
       <w:pPr>
         <w:rPr>
           <w:rFonts w:hint="eastAsia"/>
         </w:rPr>
       </w:pPr>
-      <w:r>
-        <w:rPr>
-          <w:rFonts w:hint="eastAsia"/>
-        </w:rPr>
-        <w:t xml:space="preserve">During the </w:t>
-      </w:r>
-      <w:r>
-        <w:rPr>
-          <w:rFonts w:hint="eastAsia"/>
-        </w:rPr>
-        <w:t xml:space="preserve">agentic workflow improvement and post training of Gemma 4 31B, we detected that there are group of failure caused by repeated tool calling until run out of budget which could be </w:t>
-      </w:r>
-      <w:r>
-        <w:t>stably</w:t>
-      </w:r>
-      <w:r>
-        <w:rPr>
-          <w:rFonts w:hint="eastAsia"/>
-        </w:rPr>
-        <w:t xml:space="preserve"> reproduced. We tried to deduce the </w:t>
-      </w:r>
-      <w:r>
-        <w:t>attribution</w:t>
-      </w:r>
-      <w:r>
-        <w:rPr>
-          <w:rFonts w:hint="eastAsia"/>
-        </w:rPr>
-        <w:t xml:space="preserve"> of this phenomenon</w:t>
-      </w:r>
-      <w:r>
-        <w:rPr>
-          <w:rFonts w:hint="eastAsia"/>
-        </w:rPr>
-        <w:t xml:space="preserve"> (we call it as loop)</w:t>
-      </w:r>
-      <w:r>
-        <w:rPr>
-          <w:rFonts w:hint="eastAsia"/>
-        </w:rPr>
-        <w:t xml:space="preserve"> and </w:t>
-      </w:r>
-      <w:r>
-        <w:t>interrupt</w:t>
-      </w:r>
-      <w:r>
-        <w:rPr>
-          <w:rFonts w:hint="eastAsia"/>
-        </w:rPr>
-        <w:t xml:space="preserve"> it</w:t>
-      </w:r>
-      <w:r>
-        <w:rPr>
-          <w:rFonts w:hint="eastAsia"/>
-        </w:rPr>
-        <w:t xml:space="preserve"> (we call it as escape)</w:t>
-      </w:r>
-      <w:r>
-        <w:rPr>
-          <w:rFonts w:hint="eastAsia"/>
-        </w:rPr>
-        <w:t xml:space="preserve"> in following experiments. What we learn are 1.</w:t>
-      </w:r>
-      <w:r>
-        <w:rPr>
-          <w:rFonts w:hint="eastAsia"/>
-        </w:rPr>
-        <w:t>t</w:t>
-      </w:r>
-      <w:r>
-        <w:rPr>
-          <w:rFonts w:hint="eastAsia"/>
-        </w:rPr>
-        <w:t xml:space="preserve">he </w:t>
-      </w:r>
-      <w:r>
-        <w:rPr>
-          <w:rFonts w:hint="eastAsia"/>
-        </w:rPr>
-        <w:t xml:space="preserve">possible cause of loop is that agent will reinforce its </w:t>
-      </w:r>
-      <w:r>
-        <w:rPr>
-          <w:rFonts w:hint="eastAsia"/>
-        </w:rPr>
-        <w:t>latest</w:t>
-      </w:r>
-      <w:r>
-        <w:rPr>
-          <w:rFonts w:hint="eastAsia"/>
-        </w:rPr>
-        <w:t xml:space="preserve"> </w:t>
-      </w:r>
-      <w:r>
-        <w:rPr>
-          <w:rFonts w:hint="eastAsia"/>
-        </w:rPr>
-        <w:t>action</w:t>
-      </w:r>
-      <w:r>
-        <w:rPr>
-          <w:rFonts w:hint="eastAsia"/>
-        </w:rPr>
-        <w:t>s</w:t>
-      </w:r>
-      <w:r>
-        <w:rPr>
-          <w:rFonts w:hint="eastAsia"/>
-        </w:rPr>
-        <w:t xml:space="preserve"> while no </w:t>
-      </w:r>
-      <w:r>
-        <w:rPr>
-          <w:rFonts w:hint="eastAsia"/>
-        </w:rPr>
-        <w:t xml:space="preserve">clear positive/negative feedback for </w:t>
-      </w:r>
-      <w:r>
-        <w:rPr>
-          <w:rFonts w:hint="eastAsia"/>
-        </w:rPr>
-        <w:t>it</w:t>
-      </w:r>
-      <w:r>
-        <w:rPr>
-          <w:rFonts w:hint="eastAsia"/>
-        </w:rPr>
-        <w:t>. As the round of loop increase, the possibility of loop in the next round will significantly increase</w:t>
-      </w:r>
-      <w:r>
-        <w:rPr>
-          <w:rFonts w:hint="eastAsia"/>
-        </w:rPr>
-        <w:t>; 2. It</w:t>
-      </w:r>
-      <w:r>
-        <w:t>’</w:t>
-      </w:r>
-      <w:r>
-        <w:rPr>
-          <w:rFonts w:hint="eastAsia"/>
-        </w:rPr>
-        <w:t>s possible to construct</w:t>
-      </w:r>
-      <w:r>
-        <w:rPr>
-          <w:rFonts w:hint="eastAsia"/>
-        </w:rPr>
-        <w:t xml:space="preserve"> partial</w:t>
-      </w:r>
-      <w:r>
-        <w:rPr>
-          <w:rFonts w:hint="eastAsia"/>
-        </w:rPr>
-        <w:t xml:space="preserve"> escaping from loop</w:t>
-      </w:r>
-      <w:r>
-        <w:rPr>
-          <w:rFonts w:hint="eastAsia"/>
-        </w:rPr>
-        <w:t xml:space="preserve">, </w:t>
-      </w:r>
-      <w:r>
-        <w:rPr>
-          <w:rFonts w:hint="eastAsia"/>
-        </w:rPr>
-        <w:t>such as</w:t>
-      </w:r>
-      <w:r>
-        <w:rPr>
-          <w:rFonts w:hint="eastAsia"/>
-        </w:rPr>
-        <w:t xml:space="preserve"> forced thinking</w:t>
-      </w:r>
-      <w:r>
-        <w:rPr>
-          <w:rFonts w:hint="eastAsia"/>
-        </w:rPr>
-        <w:t>. However, all of method</w:t>
-      </w:r>
-      <w:r>
-        <w:rPr>
-          <w:rFonts w:hint="eastAsia"/>
-        </w:rPr>
-        <w:t>s</w:t>
-      </w:r>
-      <w:r>
-        <w:rPr>
-          <w:rFonts w:hint="eastAsia"/>
-        </w:rPr>
-        <w:t xml:space="preserve"> we tried can</w:t>
-      </w:r>
-      <w:r>
-        <w:t>’</w:t>
-      </w:r>
-      <w:r>
-        <w:rPr>
-          <w:rFonts w:hint="eastAsia"/>
-        </w:rPr>
-        <w:t xml:space="preserve">t </w:t>
-      </w:r>
-      <w:r>
-        <w:t>eliminate</w:t>
-      </w:r>
-      <w:r>
-        <w:rPr>
-          <w:rFonts w:hint="eastAsia"/>
-        </w:rPr>
-        <w:t xml:space="preserve"> loops completely; 3. Even </w:t>
-      </w:r>
-      <w:r>
-        <w:rPr>
-          <w:rFonts w:hint="eastAsia"/>
-        </w:rPr>
-        <w:t xml:space="preserve">an </w:t>
-      </w:r>
-      <w:r>
-        <w:rPr>
-          <w:rFonts w:hint="eastAsia"/>
-        </w:rPr>
-        <w:t xml:space="preserve">agent </w:t>
-      </w:r>
-      <w:r>
-        <w:t>escape</w:t>
-      </w:r>
-      <w:r>
-        <w:rPr>
-          <w:rFonts w:hint="eastAsia"/>
-        </w:rPr>
-        <w:t>s</w:t>
-      </w:r>
-      <w:r>
-        <w:rPr>
-          <w:rFonts w:hint="eastAsia"/>
-        </w:rPr>
-        <w:t xml:space="preserve"> from a loop</w:t>
-      </w:r>
-      <w:r>
-        <w:rPr>
-          <w:rFonts w:hint="eastAsia"/>
-        </w:rPr>
-        <w:t xml:space="preserve"> </w:t>
-      </w:r>
-      <w:r>
-        <w:t>successfully</w:t>
-      </w:r>
-      <w:r>
-        <w:rPr>
-          <w:rFonts w:hint="eastAsia"/>
-        </w:rPr>
-        <w:t xml:space="preserve">, it </w:t>
-      </w:r>
-      <w:r>
-        <w:t>doesn’t’</w:t>
-      </w:r>
-      <w:r>
-        <w:rPr>
-          <w:rFonts w:hint="eastAsia"/>
-        </w:rPr>
-        <w:t xml:space="preserve"> means agent can move to the correct track and solve the problem</w:t>
-      </w:r>
-      <w:r>
-        <w:rPr>
-          <w:rFonts w:hint="eastAsia"/>
-        </w:rPr>
-        <w:t xml:space="preserve"> before it run out of budget</w:t>
-      </w:r>
-      <w:r>
-        <w:rPr>
-          <w:rFonts w:hint="eastAsia"/>
-        </w:rPr>
-        <w:t>.</w:t>
-      </w:r>
-      <w:r>
-        <w:rPr>
-          <w:rFonts w:hint="eastAsia"/>
-        </w:rPr>
-        <w:t xml:space="preserve"> </w:t>
-      </w:r>
     </w:p>
     <w:sectPr>
       <w:pgSz w:w="11906" w:h="16838"/>
@@ -957,7 +1241,6 @@
   <w:style w:type="character" w:default="1" w:styleId="a0">
     <w:name w:val="Default Paragraph Font"/>
     <w:uiPriority w:val="1"/>
-    <w:semiHidden/>
     <w:unhideWhenUsed/>
   </w:style>
   <w:style w:type="table" w:default="1" w:styleId="a1">

</xml_diff>